<commit_message>
Update published site for GitHub Pages
</commit_message>
<xml_diff>
--- a/CV-Hector-Luis-Diaz-Padilla.docx
+++ b/CV-Hector-Luis-Diaz-Padilla.docx
@@ -115,7 +115,7 @@
           <w:sz w:val="21"/>
           <w:szCs w:val="21"/>
         </w:rPr>
-        <w:t xml:space="preserve">LinkedIn: https://www.linkedin.com/in/hector-padilla-4a7625164</w:t>
+        <w:t xml:space="preserve">LinkedIn: https://www.linkedin.com/in/hector-luis-diaz-padilla-4a7625164</w:t>
       </w:r>
     </w:p>
     <w:p>
@@ -565,7 +565,7 @@
       <w:pPr>
         <w:spacing w:after="40"/>
       </w:pPr>
-      <w:hyperlink w:history="1" r:id="rId0pjqpx-yavkosk3x5ngvp">
+      <w:hyperlink w:history="1" r:id="rIdjkipzbg9fh5szywsi0mlr">
         <w:r>
           <w:rPr>
             <w:rStyle w:val="Hyperlink"/>
@@ -582,7 +582,7 @@
       <w:pPr>
         <w:spacing w:after="40"/>
       </w:pPr>
-      <w:hyperlink w:history="1" r:id="rIddbupfq6dirfycysmsrge0">
+      <w:hyperlink w:history="1" r:id="rIdnur_rl8__kyc9jl5tthy8">
         <w:r>
           <w:rPr>
             <w:rStyle w:val="Hyperlink"/>
@@ -646,7 +646,7 @@
       <w:pPr>
         <w:spacing w:after="40"/>
       </w:pPr>
-      <w:hyperlink w:history="1" r:id="rIdnpwpc9hihzweqfuljhdqy">
+      <w:hyperlink w:history="1" r:id="rIdwddj2kn4hpfjqe3tk_wjr">
         <w:r>
           <w:rPr>
             <w:rStyle w:val="Hyperlink"/>
@@ -710,7 +710,7 @@
       <w:pPr>
         <w:spacing w:after="40"/>
       </w:pPr>
-      <w:hyperlink w:history="1" r:id="rIdg6pygh9lmaxf5yygxbrbe">
+      <w:hyperlink w:history="1" r:id="rIdespdytcka8kmn_ls-fgnf">
         <w:r>
           <w:rPr>
             <w:rStyle w:val="Hyperlink"/>
@@ -775,7 +775,7 @@
       <w:pPr>
         <w:spacing w:after="40"/>
       </w:pPr>
-      <w:hyperlink w:history="1" r:id="rIdqmyi_iigsknwxj7z21lzn">
+      <w:hyperlink w:history="1" r:id="rIduh9403fex3ynncyhpynuq">
         <w:r>
           <w:rPr>
             <w:rStyle w:val="Hyperlink"/>
@@ -792,7 +792,7 @@
       <w:pPr>
         <w:spacing w:after="40"/>
       </w:pPr>
-      <w:hyperlink w:history="1" r:id="rIdaaqk1ot-mw0edsjrotfhk">
+      <w:hyperlink w:history="1" r:id="rIdu7wm6s3luwt4m4lmomzdf">
         <w:r>
           <w:rPr>
             <w:rStyle w:val="Hyperlink"/>
@@ -1040,7 +1040,7 @@
       <w:pPr>
         <w:spacing w:after="40"/>
       </w:pPr>
-      <w:hyperlink w:history="1" r:id="rId_idgs2aqmgyax20x9sjxe">
+      <w:hyperlink w:history="1" r:id="rIdm2pksnmwxwhbehebjdfdo">
         <w:r>
           <w:rPr>
             <w:rStyle w:val="Hyperlink"/>
@@ -1057,7 +1057,7 @@
       <w:pPr>
         <w:spacing w:after="40"/>
       </w:pPr>
-      <w:hyperlink w:history="1" r:id="rIdbvgpxkwyblrj5yy5hkwau">
+      <w:hyperlink w:history="1" r:id="rIdwczz1_9aobaqjk5egfus_">
         <w:r>
           <w:rPr>
             <w:rStyle w:val="Hyperlink"/>
@@ -1074,7 +1074,7 @@
       <w:pPr>
         <w:spacing w:after="40"/>
       </w:pPr>
-      <w:hyperlink w:history="1" r:id="rIdzjdfjgemtgdgzodc4vcez">
+      <w:hyperlink w:history="1" r:id="rIduvblfhfepitjbiltyd3ap">
         <w:r>
           <w:rPr>
             <w:rStyle w:val="Hyperlink"/>
@@ -1091,7 +1091,7 @@
       <w:pPr>
         <w:spacing w:after="40"/>
       </w:pPr>
-      <w:hyperlink w:history="1" r:id="rIdzhiunxpe7r5gghshv68wp">
+      <w:hyperlink w:history="1" r:id="rIdxru0yqkdzpxpq4je3oobj">
         <w:r>
           <w:rPr>
             <w:rStyle w:val="Hyperlink"/>
@@ -1108,7 +1108,7 @@
       <w:pPr>
         <w:spacing w:after="40"/>
       </w:pPr>
-      <w:hyperlink w:history="1" r:id="rIdpw_puwh8mwca5gql2z5ln">
+      <w:hyperlink w:history="1" r:id="rIdpsmwzkdwx6-y7fiimldhx">
         <w:r>
           <w:rPr>
             <w:rStyle w:val="Hyperlink"/>
@@ -1125,7 +1125,7 @@
       <w:pPr>
         <w:spacing w:after="40"/>
       </w:pPr>
-      <w:hyperlink w:history="1" r:id="rIdnqd7vppibeoe9c3cehabf">
+      <w:hyperlink w:history="1" r:id="rId3m1mflhzf3mk2ogerogk_">
         <w:r>
           <w:rPr>
             <w:rStyle w:val="Hyperlink"/>
@@ -1142,7 +1142,7 @@
       <w:pPr>
         <w:spacing w:after="40"/>
       </w:pPr>
-      <w:hyperlink w:history="1" r:id="rIdmkjvu6xfiepeolnzfib4n">
+      <w:hyperlink w:history="1" r:id="rIdhi9zliverjunq7c8sft_r">
         <w:r>
           <w:rPr>
             <w:rStyle w:val="Hyperlink"/>
@@ -1159,7 +1159,7 @@
       <w:pPr>
         <w:spacing w:after="40"/>
       </w:pPr>
-      <w:hyperlink w:history="1" r:id="rIdb7wficq53fqa4fkc71nyg">
+      <w:hyperlink w:history="1" r:id="rIds6s_diat64pghwx4f5fcc">
         <w:r>
           <w:rPr>
             <w:rStyle w:val="Hyperlink"/>

</xml_diff>